<commit_message>
Entrega ciclo 2, blueJ completo y retrospectiva, falta el astah actualizado
</commit_message>
<xml_diff>
--- a/RetrospectivaStackingItems.docx
+++ b/RetrospectivaStackingItems.docx
@@ -29,12 +29,32 @@
       </w:r>
       <w:proofErr w:type="spellEnd"/>
       <w:r>
-        <w:t xml:space="preserve"> 1: La torre existe y acepta elementos</w:t>
-      </w:r>
-    </w:p>
-    <w:p>
-      <w:r>
-        <w:t>Entregable: Puedo crear una torre y agregar/quitar tazas y tapas</w:t>
+        <w:t xml:space="preserve"> 1: </w:t>
+      </w:r>
+      <w:r>
+        <w:t xml:space="preserve">Constructor de Tower con parámetro </w:t>
+      </w:r>
+      <w:proofErr w:type="spellStart"/>
+      <w:r>
+        <w:t>int</w:t>
+      </w:r>
+      <w:proofErr w:type="spellEnd"/>
+      <w:r>
+        <w:t xml:space="preserve"> (numero de tazas que se desean)</w:t>
+      </w:r>
+      <w:r>
+        <w:t xml:space="preserve"> </w:t>
+      </w:r>
+      <w:proofErr w:type="spellStart"/>
+      <w:r>
+        <w:t>y</w:t>
+      </w:r>
+      <w:proofErr w:type="spellEnd"/>
+      <w:r>
+        <w:t xml:space="preserve"> </w:t>
+      </w:r>
+      <w:r>
+        <w:t>intercambiar dos elementos.</w:t>
       </w:r>
     </w:p>
     <w:p>
@@ -45,7 +65,15 @@
         </w:numPr>
       </w:pPr>
       <w:r>
-        <w:t>Tower constructor</w:t>
+        <w:t>Tower(</w:t>
+      </w:r>
+      <w:proofErr w:type="spellStart"/>
+      <w:r>
+        <w:t>int</w:t>
+      </w:r>
+      <w:proofErr w:type="spellEnd"/>
+      <w:r>
+        <w:t>)</w:t>
       </w:r>
     </w:p>
     <w:p>
@@ -55,139 +83,32 @@
           <w:numId w:val="2"/>
         </w:numPr>
       </w:pPr>
-      <w:r>
-        <w:t xml:space="preserve">Cup constructor + </w:t>
-      </w:r>
+      <w:proofErr w:type="gramStart"/>
+      <w:r>
+        <w:t>S</w:t>
+      </w:r>
+      <w:r>
+        <w:t>wap</w:t>
+      </w:r>
+      <w:r>
+        <w:t>(</w:t>
+      </w:r>
+      <w:proofErr w:type="gramEnd"/>
+      <w:r>
+        <w:t>)</w:t>
+      </w:r>
+    </w:p>
+    <w:p>
       <w:proofErr w:type="spellStart"/>
-      <w:proofErr w:type="gramStart"/>
-      <w:r>
-        <w:t>getHeight</w:t>
+      <w:r>
+        <w:t>Mini-ciclo</w:t>
       </w:r>
       <w:proofErr w:type="spellEnd"/>
       <w:r>
-        <w:t>(</w:t>
-      </w:r>
-      <w:proofErr w:type="gramEnd"/>
-      <w:r>
-        <w:t>)</w:t>
-      </w:r>
-    </w:p>
-    <w:p>
-      <w:pPr>
-        <w:numPr>
-          <w:ilvl w:val="0"/>
-          <w:numId w:val="2"/>
-        </w:numPr>
-      </w:pPr>
-      <w:proofErr w:type="gramStart"/>
-      <w:r>
-        <w:t>Lid constructor</w:t>
-      </w:r>
-      <w:proofErr w:type="gramEnd"/>
-      <w:r>
-        <w:t xml:space="preserve"> + </w:t>
-      </w:r>
-      <w:proofErr w:type="spellStart"/>
-      <w:proofErr w:type="gramStart"/>
-      <w:r>
-        <w:t>getHeight</w:t>
-      </w:r>
-      <w:proofErr w:type="spellEnd"/>
-      <w:r>
-        <w:t>(</w:t>
-      </w:r>
-      <w:proofErr w:type="gramEnd"/>
-      <w:r>
-        <w:t>)</w:t>
-      </w:r>
-    </w:p>
-    <w:p>
-      <w:pPr>
-        <w:numPr>
-          <w:ilvl w:val="0"/>
-          <w:numId w:val="2"/>
-        </w:numPr>
-      </w:pPr>
-      <w:proofErr w:type="spellStart"/>
-      <w:r>
-        <w:t>pushCup</w:t>
-      </w:r>
-      <w:proofErr w:type="spellEnd"/>
-      <w:r>
-        <w:t xml:space="preserve">, </w:t>
-      </w:r>
-      <w:proofErr w:type="spellStart"/>
-      <w:r>
-        <w:t>pushLid</w:t>
-      </w:r>
-      <w:proofErr w:type="spellEnd"/>
-    </w:p>
-    <w:p>
-      <w:pPr>
-        <w:numPr>
-          <w:ilvl w:val="0"/>
-          <w:numId w:val="2"/>
-        </w:numPr>
-      </w:pPr>
-      <w:proofErr w:type="spellStart"/>
-      <w:r>
-        <w:t>popCup</w:t>
-      </w:r>
-      <w:proofErr w:type="spellEnd"/>
-      <w:r>
-        <w:t xml:space="preserve">, </w:t>
-      </w:r>
-      <w:proofErr w:type="spellStart"/>
-      <w:r>
-        <w:t>popLid</w:t>
-      </w:r>
-      <w:proofErr w:type="spellEnd"/>
-    </w:p>
-    <w:p>
-      <w:pPr>
-        <w:numPr>
-          <w:ilvl w:val="0"/>
-          <w:numId w:val="2"/>
-        </w:numPr>
-      </w:pPr>
-      <w:proofErr w:type="spellStart"/>
-      <w:r>
-        <w:t>removeCup</w:t>
-      </w:r>
-      <w:proofErr w:type="spellEnd"/>
-      <w:r>
-        <w:t xml:space="preserve">, </w:t>
-      </w:r>
-      <w:proofErr w:type="spellStart"/>
-      <w:r>
-        <w:t>removeLid</w:t>
-      </w:r>
-      <w:proofErr w:type="spellEnd"/>
-    </w:p>
-    <w:p>
-      <w:pPr>
-        <w:numPr>
-          <w:ilvl w:val="0"/>
-          <w:numId w:val="2"/>
-        </w:numPr>
-      </w:pPr>
-      <w:proofErr w:type="gramStart"/>
-      <w:r>
-        <w:t>ok(</w:t>
-      </w:r>
-      <w:proofErr w:type="gramEnd"/>
-      <w:r>
-        <w:t>)</w:t>
-      </w:r>
-    </w:p>
-    <w:p>
-      <w:proofErr w:type="spellStart"/>
-      <w:r>
-        <w:t>Mini-ciclo</w:t>
-      </w:r>
-      <w:proofErr w:type="spellEnd"/>
-      <w:r>
-        <w:t xml:space="preserve"> 2: La torre informa su estado</w:t>
+        <w:t xml:space="preserve"> 2: </w:t>
+      </w:r>
+      <w:r>
+        <w:t>Tapa todas las tazas que se pueda, Consultar un intercambio que reduzca la altura y marcar las tazas tapadas (requisito de usabilidad).</w:t>
       </w:r>
     </w:p>
     <w:p>
@@ -202,14 +123,9 @@
           <w:numId w:val="3"/>
         </w:numPr>
       </w:pPr>
-      <w:proofErr w:type="spellStart"/>
       <w:proofErr w:type="gramStart"/>
       <w:r>
-        <w:t>height</w:t>
-      </w:r>
-      <w:proofErr w:type="spellEnd"/>
-      <w:r>
-        <w:t>(</w:t>
+        <w:t>Cover(</w:t>
       </w:r>
       <w:proofErr w:type="gramEnd"/>
       <w:r>
@@ -226,7 +142,7 @@
       <w:proofErr w:type="spellStart"/>
       <w:proofErr w:type="gramStart"/>
       <w:r>
-        <w:t>lidedCups</w:t>
+        <w:t>swapToReduce</w:t>
       </w:r>
       <w:proofErr w:type="spellEnd"/>
       <w:r>
@@ -247,13 +163,13 @@
       <w:proofErr w:type="spellStart"/>
       <w:proofErr w:type="gramStart"/>
       <w:r>
-        <w:t>stackingItems</w:t>
+        <w:t>lid.setAsCovering</w:t>
       </w:r>
       <w:proofErr w:type="spellEnd"/>
+      <w:proofErr w:type="gramEnd"/>
       <w:r>
         <w:t>(</w:t>
       </w:r>
-      <w:proofErr w:type="gramEnd"/>
       <w:r>
         <w:t>)</w:t>
       </w:r>
@@ -265,12 +181,29 @@
       </w:r>
       <w:proofErr w:type="spellEnd"/>
       <w:r>
-        <w:t xml:space="preserve"> 3: La torre se puede reorganizar y visualizar</w:t>
-      </w:r>
-    </w:p>
-    <w:p>
-      <w:r>
-        <w:t>Entregable: La torre funciona completamente</w:t>
+        <w:t xml:space="preserve"> 3: </w:t>
+      </w:r>
+      <w:r>
+        <w:t>Pruebas</w:t>
+      </w:r>
+      <w:r>
+        <w:t>.</w:t>
+      </w:r>
+    </w:p>
+    <w:p>
+      <w:pPr>
+        <w:pStyle w:val="Prrafodelista"/>
+        <w:numPr>
+          <w:ilvl w:val="0"/>
+          <w:numId w:val="5"/>
+        </w:numPr>
+      </w:pPr>
+      <w:r>
+        <w:rPr>
+          <w:b/>
+          <w:bCs/>
+        </w:rPr>
+        <w:t>TowerC2Test</w:t>
       </w:r>
     </w:p>
     <w:p>
@@ -283,7 +216,7 @@
       <w:proofErr w:type="spellStart"/>
       <w:proofErr w:type="gramStart"/>
       <w:r>
-        <w:t>orderTower</w:t>
+        <w:t>testInvalidSwapRevertsGracefully</w:t>
       </w:r>
       <w:proofErr w:type="spellEnd"/>
       <w:r>
@@ -304,7 +237,7 @@
       <w:proofErr w:type="spellStart"/>
       <w:proofErr w:type="gramStart"/>
       <w:r>
-        <w:t>reverseTower</w:t>
+        <w:t>testSwapToReduceReturnsValid</w:t>
       </w:r>
       <w:proofErr w:type="spellEnd"/>
       <w:r>
@@ -325,20 +258,7 @@
       <w:proofErr w:type="spellStart"/>
       <w:proofErr w:type="gramStart"/>
       <w:r>
-        <w:t>makeVisible</w:t>
-      </w:r>
-      <w:proofErr w:type="spellEnd"/>
-      <w:r>
-        <w:t>(</w:t>
-      </w:r>
-      <w:proofErr w:type="gramEnd"/>
-      <w:r>
-        <w:t xml:space="preserve">), </w:t>
-      </w:r>
-      <w:proofErr w:type="spellStart"/>
-      <w:proofErr w:type="gramStart"/>
-      <w:r>
-        <w:t>makeInvisible</w:t>
+        <w:t>testCoverLids</w:t>
       </w:r>
       <w:proofErr w:type="spellEnd"/>
       <w:r>
@@ -357,12 +277,17 @@
         </w:numPr>
       </w:pPr>
       <w:proofErr w:type="spellStart"/>
-      <w:r>
-        <w:t>exit</w:t>
+      <w:proofErr w:type="gramStart"/>
+      <w:r>
+        <w:t>testCreateTowerWithCups</w:t>
       </w:r>
       <w:proofErr w:type="spellEnd"/>
       <w:r>
-        <w:t>()</w:t>
+        <w:t>(</w:t>
+      </w:r>
+      <w:proofErr w:type="gramEnd"/>
+      <w:r>
+        <w:t>)</w:t>
       </w:r>
     </w:p>
     <w:p/>
@@ -396,13 +321,17 @@
       </w:r>
       <w:proofErr w:type="spellEnd"/>
       <w:r>
-        <w:t xml:space="preserve">, pero </w:t>
-      </w:r>
-      <w:r>
-        <w:t>hay una pequeña parte en las tapas que no se grafica como debería</w:t>
-      </w:r>
-    </w:p>
-    <w:p/>
+        <w:t xml:space="preserve">, </w:t>
+      </w:r>
+      <w:r>
+        <w:t xml:space="preserve">con las pruebas que realizamos se cumple lo que propusimos en los </w:t>
+      </w:r>
+      <w:proofErr w:type="spellStart"/>
+      <w:r>
+        <w:t>miniciclos</w:t>
+      </w:r>
+      <w:proofErr w:type="spellEnd"/>
+    </w:p>
     <w:p>
       <w:pPr>
         <w:pStyle w:val="Prrafodelista"/>
@@ -412,7 +341,6 @@
         </w:numPr>
       </w:pPr>
       <w:r>
-        <w:lastRenderedPageBreak/>
         <w:t>¿Cuál fue el tiempo total invertido por cada uno de ustedes? (Horas/Hombre)</w:t>
       </w:r>
     </w:p>
@@ -432,7 +360,7 @@
         <w:t>Samuel – 1</w:t>
       </w:r>
       <w:r>
-        <w:t>1</w:t>
+        <w:t>2</w:t>
       </w:r>
       <w:r>
         <w:t xml:space="preserve"> horas</w:t>
@@ -452,7 +380,15 @@
     </w:p>
     <w:p>
       <w:r>
-        <w:t>Lograr aplicar la mayoría de los requerimientos</w:t>
+        <w:t xml:space="preserve">Lograr que el método </w:t>
+      </w:r>
+      <w:proofErr w:type="gramStart"/>
+      <w:r>
+        <w:t>swap(</w:t>
+      </w:r>
+      <w:proofErr w:type="gramEnd"/>
+      <w:r>
+        <w:t>) funcione adecuadamente.</w:t>
       </w:r>
     </w:p>
     <w:p>
@@ -464,23 +400,13 @@
         </w:numPr>
       </w:pPr>
       <w:r>
+        <w:lastRenderedPageBreak/>
         <w:t>¿Cuál consideran que fue el mayor problema técnico? ¿Qué hicieron para resolverlo?</w:t>
       </w:r>
     </w:p>
     <w:p>
       <w:r>
-        <w:t xml:space="preserve">Usar correctamente </w:t>
-      </w:r>
-      <w:proofErr w:type="spellStart"/>
-      <w:r>
-        <w:t>shapes</w:t>
-      </w:r>
-      <w:proofErr w:type="spellEnd"/>
-      <w:r>
-        <w:t xml:space="preserve"> para graficar</w:t>
-      </w:r>
-      <w:r>
-        <w:t>, algunos diagramas de secuencia</w:t>
+        <w:t>No tuvimos ningún problema técnico notable en este ciclo.</w:t>
       </w:r>
     </w:p>
     <w:p>
@@ -497,7 +423,10 @@
     </w:p>
     <w:p>
       <w:r>
-        <w:t>Trabajar juntos</w:t>
+        <w:t xml:space="preserve">Trabajar </w:t>
+      </w:r>
+      <w:r>
+        <w:t>en equipo, que ambos fuéramos entendiendo todo.</w:t>
       </w:r>
     </w:p>
     <w:p>
@@ -522,7 +451,22 @@
       </w:r>
       <w:proofErr w:type="spellEnd"/>
       <w:r>
-        <w:t>, intentamos siempre aplicarla, haciendo que solo uno programe al tiempo</w:t>
+        <w:t xml:space="preserve">, intentamos siempre aplicarla, haciendo que solo uno programe </w:t>
+      </w:r>
+      <w:r>
+        <w:t xml:space="preserve">o modele </w:t>
+      </w:r>
+      <w:r>
+        <w:t>al</w:t>
+      </w:r>
+      <w:r>
+        <w:t xml:space="preserve"> mismo</w:t>
+      </w:r>
+      <w:r>
+        <w:t xml:space="preserve"> tiempo</w:t>
+      </w:r>
+      <w:r>
+        <w:t>.</w:t>
       </w:r>
     </w:p>
     <w:p>
@@ -943,6 +887,119 @@
     </w:lvl>
   </w:abstractNum>
   <w:abstractNum w:abstractNumId="3" w15:restartNumberingAfterBreak="0">
+    <w:nsid w:val="6EDF303E"/>
+    <w:multiLevelType w:val="hybridMultilevel"/>
+    <w:tmpl w:val="FB72075E"/>
+    <w:lvl w:ilvl="0" w:tplc="080A0001">
+      <w:start w:val="1"/>
+      <w:numFmt w:val="bullet"/>
+      <w:lvlText w:val=""/>
+      <w:lvlJc w:val="left"/>
+      <w:pPr>
+        <w:ind w:left="720" w:hanging="360"/>
+      </w:pPr>
+      <w:rPr>
+        <w:rFonts w:ascii="Symbol" w:hAnsi="Symbol" w:hint="default"/>
+      </w:rPr>
+    </w:lvl>
+    <w:lvl w:ilvl="1" w:tplc="080A0003" w:tentative="1">
+      <w:start w:val="1"/>
+      <w:numFmt w:val="bullet"/>
+      <w:lvlText w:val="o"/>
+      <w:lvlJc w:val="left"/>
+      <w:pPr>
+        <w:ind w:left="1440" w:hanging="360"/>
+      </w:pPr>
+      <w:rPr>
+        <w:rFonts w:ascii="Courier New" w:hAnsi="Courier New" w:cs="Courier New" w:hint="default"/>
+      </w:rPr>
+    </w:lvl>
+    <w:lvl w:ilvl="2" w:tplc="080A0005" w:tentative="1">
+      <w:start w:val="1"/>
+      <w:numFmt w:val="bullet"/>
+      <w:lvlText w:val=""/>
+      <w:lvlJc w:val="left"/>
+      <w:pPr>
+        <w:ind w:left="2160" w:hanging="360"/>
+      </w:pPr>
+      <w:rPr>
+        <w:rFonts w:ascii="Wingdings" w:hAnsi="Wingdings" w:hint="default"/>
+      </w:rPr>
+    </w:lvl>
+    <w:lvl w:ilvl="3" w:tplc="080A0001" w:tentative="1">
+      <w:start w:val="1"/>
+      <w:numFmt w:val="bullet"/>
+      <w:lvlText w:val=""/>
+      <w:lvlJc w:val="left"/>
+      <w:pPr>
+        <w:ind w:left="2880" w:hanging="360"/>
+      </w:pPr>
+      <w:rPr>
+        <w:rFonts w:ascii="Symbol" w:hAnsi="Symbol" w:hint="default"/>
+      </w:rPr>
+    </w:lvl>
+    <w:lvl w:ilvl="4" w:tplc="080A0003" w:tentative="1">
+      <w:start w:val="1"/>
+      <w:numFmt w:val="bullet"/>
+      <w:lvlText w:val="o"/>
+      <w:lvlJc w:val="left"/>
+      <w:pPr>
+        <w:ind w:left="3600" w:hanging="360"/>
+      </w:pPr>
+      <w:rPr>
+        <w:rFonts w:ascii="Courier New" w:hAnsi="Courier New" w:cs="Courier New" w:hint="default"/>
+      </w:rPr>
+    </w:lvl>
+    <w:lvl w:ilvl="5" w:tplc="080A0005" w:tentative="1">
+      <w:start w:val="1"/>
+      <w:numFmt w:val="bullet"/>
+      <w:lvlText w:val=""/>
+      <w:lvlJc w:val="left"/>
+      <w:pPr>
+        <w:ind w:left="4320" w:hanging="360"/>
+      </w:pPr>
+      <w:rPr>
+        <w:rFonts w:ascii="Wingdings" w:hAnsi="Wingdings" w:hint="default"/>
+      </w:rPr>
+    </w:lvl>
+    <w:lvl w:ilvl="6" w:tplc="080A0001" w:tentative="1">
+      <w:start w:val="1"/>
+      <w:numFmt w:val="bullet"/>
+      <w:lvlText w:val=""/>
+      <w:lvlJc w:val="left"/>
+      <w:pPr>
+        <w:ind w:left="5040" w:hanging="360"/>
+      </w:pPr>
+      <w:rPr>
+        <w:rFonts w:ascii="Symbol" w:hAnsi="Symbol" w:hint="default"/>
+      </w:rPr>
+    </w:lvl>
+    <w:lvl w:ilvl="7" w:tplc="080A0003" w:tentative="1">
+      <w:start w:val="1"/>
+      <w:numFmt w:val="bullet"/>
+      <w:lvlText w:val="o"/>
+      <w:lvlJc w:val="left"/>
+      <w:pPr>
+        <w:ind w:left="5760" w:hanging="360"/>
+      </w:pPr>
+      <w:rPr>
+        <w:rFonts w:ascii="Courier New" w:hAnsi="Courier New" w:cs="Courier New" w:hint="default"/>
+      </w:rPr>
+    </w:lvl>
+    <w:lvl w:ilvl="8" w:tplc="080A0005" w:tentative="1">
+      <w:start w:val="1"/>
+      <w:numFmt w:val="bullet"/>
+      <w:lvlText w:val=""/>
+      <w:lvlJc w:val="left"/>
+      <w:pPr>
+        <w:ind w:left="6480" w:hanging="360"/>
+      </w:pPr>
+      <w:rPr>
+        <w:rFonts w:ascii="Wingdings" w:hAnsi="Wingdings" w:hint="default"/>
+      </w:rPr>
+    </w:lvl>
+  </w:abstractNum>
+  <w:abstractNum w:abstractNumId="4" w15:restartNumberingAfterBreak="0">
     <w:nsid w:val="7F216A14"/>
     <w:multiLevelType w:val="multilevel"/>
     <w:tmpl w:val="9DAC6F2E"/>
@@ -1098,10 +1155,13 @@
     <w:abstractNumId w:val="1"/>
   </w:num>
   <w:num w:numId="3" w16cid:durableId="1526092592">
-    <w:abstractNumId w:val="3"/>
+    <w:abstractNumId w:val="4"/>
   </w:num>
   <w:num w:numId="4" w16cid:durableId="1213616809">
     <w:abstractNumId w:val="0"/>
+  </w:num>
+  <w:num w:numId="5" w16cid:durableId="1215042787">
+    <w:abstractNumId w:val="3"/>
   </w:num>
 </w:numbering>
 </file>
@@ -1709,7 +1769,6 @@
   <w:style w:type="character" w:default="1" w:styleId="Fuentedeprrafopredeter">
     <w:name w:val="Default Paragraph Font"/>
     <w:uiPriority w:val="1"/>
-    <w:semiHidden/>
     <w:unhideWhenUsed/>
   </w:style>
   <w:style w:type="table" w:default="1" w:styleId="Tablanormal">

</xml_diff>

<commit_message>
Habiamos subido el archivo astah que no era, tuvimos una confusion y subimos el astah de el laboratorio y no nos habiamos dado cuenta
</commit_message>
<xml_diff>
--- a/RetrospectivaStackingItems.docx
+++ b/RetrospectivaStackingItems.docx
@@ -11,286 +11,36 @@
         </w:numPr>
       </w:pPr>
       <w:r>
-        <w:t xml:space="preserve">¿Cuáles fueron los </w:t>
-      </w:r>
-      <w:proofErr w:type="spellStart"/>
-      <w:r>
-        <w:t>mini-ciclos</w:t>
-      </w:r>
-      <w:proofErr w:type="spellEnd"/>
-      <w:r>
-        <w:t xml:space="preserve"> definidos? Justifíquenlos.</w:t>
+        <w:t>¿Cuáles fueron los mini-ciclos definidos? Justifíquenlos.</w:t>
       </w:r>
     </w:p>
     <w:p>
-      <w:proofErr w:type="spellStart"/>
-      <w:r>
-        <w:t>Mini-ciclo</w:t>
-      </w:r>
-      <w:proofErr w:type="spellEnd"/>
-      <w:r>
-        <w:t xml:space="preserve"> 1: </w:t>
-      </w:r>
-      <w:r>
-        <w:t xml:space="preserve">Constructor de Tower con parámetro </w:t>
-      </w:r>
-      <w:proofErr w:type="spellStart"/>
-      <w:r>
-        <w:t>int</w:t>
-      </w:r>
-      <w:proofErr w:type="spellEnd"/>
-      <w:r>
-        <w:t xml:space="preserve"> (numero de tazas que se desean)</w:t>
-      </w:r>
-      <w:r>
-        <w:t xml:space="preserve"> </w:t>
-      </w:r>
-      <w:proofErr w:type="spellStart"/>
-      <w:r>
-        <w:t>y</w:t>
-      </w:r>
-      <w:proofErr w:type="spellEnd"/>
-      <w:r>
-        <w:t xml:space="preserve"> </w:t>
-      </w:r>
-      <w:r>
-        <w:t>intercambiar dos elementos.</w:t>
+      <w:r>
+        <w:t xml:space="preserve">Mini-ciclo 1: </w:t>
+      </w:r>
+      <w:r>
+        <w:t>Plantear la lógica y el código para solucionar TowerContest</w:t>
       </w:r>
     </w:p>
     <w:p>
-      <w:pPr>
-        <w:numPr>
-          <w:ilvl w:val="0"/>
-          <w:numId w:val="2"/>
-        </w:numPr>
-      </w:pPr>
-      <w:r>
-        <w:t>Tower(</w:t>
-      </w:r>
-      <w:proofErr w:type="spellStart"/>
-      <w:r>
-        <w:t>int</w:t>
-      </w:r>
-      <w:proofErr w:type="spellEnd"/>
-      <w:r>
-        <w:t>)</w:t>
+      <w:r>
+        <w:t xml:space="preserve">Mini-ciclo 2: </w:t>
+      </w:r>
+      <w:r>
+        <w:t>Crear el simulador para TowerContest</w:t>
       </w:r>
     </w:p>
     <w:p>
-      <w:pPr>
-        <w:numPr>
-          <w:ilvl w:val="0"/>
-          <w:numId w:val="2"/>
-        </w:numPr>
-      </w:pPr>
-      <w:proofErr w:type="gramStart"/>
-      <w:r>
-        <w:t>S</w:t>
-      </w:r>
-      <w:r>
-        <w:t>wap</w:t>
-      </w:r>
-      <w:r>
-        <w:t>(</w:t>
-      </w:r>
-      <w:proofErr w:type="gramEnd"/>
-      <w:r>
-        <w:t>)</w:t>
+      <w:r>
+        <w:t xml:space="preserve">Mini-ciclo 3: </w:t>
+      </w:r>
+      <w:r>
+        <w:t>Pruebas</w:t>
+      </w:r>
+      <w:r>
+        <w:t>.</w:t>
       </w:r>
     </w:p>
-    <w:p>
-      <w:proofErr w:type="spellStart"/>
-      <w:r>
-        <w:t>Mini-ciclo</w:t>
-      </w:r>
-      <w:proofErr w:type="spellEnd"/>
-      <w:r>
-        <w:t xml:space="preserve"> 2: </w:t>
-      </w:r>
-      <w:r>
-        <w:t>Tapa todas las tazas que se pueda, Consultar un intercambio que reduzca la altura y marcar las tazas tapadas (requisito de usabilidad).</w:t>
-      </w:r>
-    </w:p>
-    <w:p>
-      <w:r>
-        <w:t>Entregable: Puedo consultar qué hay en la torre</w:t>
-      </w:r>
-    </w:p>
-    <w:p>
-      <w:pPr>
-        <w:numPr>
-          <w:ilvl w:val="0"/>
-          <w:numId w:val="3"/>
-        </w:numPr>
-      </w:pPr>
-      <w:proofErr w:type="gramStart"/>
-      <w:r>
-        <w:t>Cover(</w:t>
-      </w:r>
-      <w:proofErr w:type="gramEnd"/>
-      <w:r>
-        <w:t>)</w:t>
-      </w:r>
-    </w:p>
-    <w:p>
-      <w:pPr>
-        <w:numPr>
-          <w:ilvl w:val="0"/>
-          <w:numId w:val="3"/>
-        </w:numPr>
-      </w:pPr>
-      <w:proofErr w:type="spellStart"/>
-      <w:proofErr w:type="gramStart"/>
-      <w:r>
-        <w:t>swapToReduce</w:t>
-      </w:r>
-      <w:proofErr w:type="spellEnd"/>
-      <w:r>
-        <w:t>(</w:t>
-      </w:r>
-      <w:proofErr w:type="gramEnd"/>
-      <w:r>
-        <w:t>)</w:t>
-      </w:r>
-    </w:p>
-    <w:p>
-      <w:pPr>
-        <w:numPr>
-          <w:ilvl w:val="0"/>
-          <w:numId w:val="3"/>
-        </w:numPr>
-      </w:pPr>
-      <w:proofErr w:type="spellStart"/>
-      <w:proofErr w:type="gramStart"/>
-      <w:r>
-        <w:t>lid.setAsCovering</w:t>
-      </w:r>
-      <w:proofErr w:type="spellEnd"/>
-      <w:proofErr w:type="gramEnd"/>
-      <w:r>
-        <w:t>(</w:t>
-      </w:r>
-      <w:r>
-        <w:t>)</w:t>
-      </w:r>
-    </w:p>
-    <w:p>
-      <w:proofErr w:type="spellStart"/>
-      <w:r>
-        <w:t>Mini-ciclo</w:t>
-      </w:r>
-      <w:proofErr w:type="spellEnd"/>
-      <w:r>
-        <w:t xml:space="preserve"> 3: </w:t>
-      </w:r>
-      <w:r>
-        <w:t>Pruebas</w:t>
-      </w:r>
-      <w:r>
-        <w:t>.</w:t>
-      </w:r>
-    </w:p>
-    <w:p>
-      <w:pPr>
-        <w:pStyle w:val="Prrafodelista"/>
-        <w:numPr>
-          <w:ilvl w:val="0"/>
-          <w:numId w:val="5"/>
-        </w:numPr>
-      </w:pPr>
-      <w:r>
-        <w:rPr>
-          <w:b/>
-          <w:bCs/>
-        </w:rPr>
-        <w:t>TowerC2Test</w:t>
-      </w:r>
-    </w:p>
-    <w:p>
-      <w:pPr>
-        <w:numPr>
-          <w:ilvl w:val="0"/>
-          <w:numId w:val="4"/>
-        </w:numPr>
-      </w:pPr>
-      <w:proofErr w:type="spellStart"/>
-      <w:proofErr w:type="gramStart"/>
-      <w:r>
-        <w:t>testInvalidSwapRevertsGracefully</w:t>
-      </w:r>
-      <w:proofErr w:type="spellEnd"/>
-      <w:r>
-        <w:t>(</w:t>
-      </w:r>
-      <w:proofErr w:type="gramEnd"/>
-      <w:r>
-        <w:t>)</w:t>
-      </w:r>
-    </w:p>
-    <w:p>
-      <w:pPr>
-        <w:numPr>
-          <w:ilvl w:val="0"/>
-          <w:numId w:val="4"/>
-        </w:numPr>
-      </w:pPr>
-      <w:proofErr w:type="spellStart"/>
-      <w:proofErr w:type="gramStart"/>
-      <w:r>
-        <w:t>testSwapToReduceReturnsValid</w:t>
-      </w:r>
-      <w:proofErr w:type="spellEnd"/>
-      <w:r>
-        <w:t>(</w:t>
-      </w:r>
-      <w:proofErr w:type="gramEnd"/>
-      <w:r>
-        <w:t>)</w:t>
-      </w:r>
-    </w:p>
-    <w:p>
-      <w:pPr>
-        <w:numPr>
-          <w:ilvl w:val="0"/>
-          <w:numId w:val="4"/>
-        </w:numPr>
-      </w:pPr>
-      <w:proofErr w:type="spellStart"/>
-      <w:proofErr w:type="gramStart"/>
-      <w:r>
-        <w:t>testCoverLids</w:t>
-      </w:r>
-      <w:proofErr w:type="spellEnd"/>
-      <w:r>
-        <w:t>(</w:t>
-      </w:r>
-      <w:proofErr w:type="gramEnd"/>
-      <w:r>
-        <w:t>)</w:t>
-      </w:r>
-    </w:p>
-    <w:p>
-      <w:pPr>
-        <w:numPr>
-          <w:ilvl w:val="0"/>
-          <w:numId w:val="4"/>
-        </w:numPr>
-      </w:pPr>
-      <w:proofErr w:type="spellStart"/>
-      <w:proofErr w:type="gramStart"/>
-      <w:r>
-        <w:t>testCreateTowerWithCups</w:t>
-      </w:r>
-      <w:proofErr w:type="spellEnd"/>
-      <w:r>
-        <w:t>(</w:t>
-      </w:r>
-      <w:proofErr w:type="gramEnd"/>
-      <w:r>
-        <w:t>)</w:t>
-      </w:r>
-    </w:p>
-    <w:p/>
     <w:p>
       <w:pPr>
         <w:pStyle w:val="Prrafodelista"/>
@@ -300,37 +50,16 @@
         </w:numPr>
       </w:pPr>
       <w:r>
-        <w:t xml:space="preserve">¿Cuál es el estado actual del proyecto en términos de </w:t>
-      </w:r>
-      <w:proofErr w:type="spellStart"/>
-      <w:r>
-        <w:t>mini-ciclos</w:t>
-      </w:r>
-      <w:proofErr w:type="spellEnd"/>
-      <w:r>
-        <w:t>? ¿por qué?</w:t>
+        <w:t>¿Cuál es el estado actual del proyecto en términos de mini-ciclos? ¿por qué?</w:t>
       </w:r>
     </w:p>
     <w:p>
       <w:r>
-        <w:t xml:space="preserve">Cumplimos con los </w:t>
-      </w:r>
-      <w:proofErr w:type="spellStart"/>
-      <w:r>
-        <w:t>mini-ciclos</w:t>
-      </w:r>
-      <w:proofErr w:type="spellEnd"/>
-      <w:r>
-        <w:t xml:space="preserve">, </w:t>
-      </w:r>
-      <w:r>
-        <w:t xml:space="preserve">con las pruebas que realizamos se cumple lo que propusimos en los </w:t>
-      </w:r>
-      <w:proofErr w:type="spellStart"/>
-      <w:r>
-        <w:t>miniciclos</w:t>
-      </w:r>
-      <w:proofErr w:type="spellEnd"/>
+        <w:t xml:space="preserve">Cumplimos con los mini-ciclos, </w:t>
+      </w:r>
+      <w:r>
+        <w:t>con las pruebas que realizamos se cumple lo que propusimos en los miniciclos</w:t>
+      </w:r>
     </w:p>
     <w:p>
       <w:pPr>
@@ -349,7 +78,7 @@
         <w:t>Carlos – 1</w:t>
       </w:r>
       <w:r>
-        <w:t>2</w:t>
+        <w:t>3</w:t>
       </w:r>
       <w:r>
         <w:t xml:space="preserve"> horas</w:t>
@@ -360,7 +89,7 @@
         <w:t>Samuel – 1</w:t>
       </w:r>
       <w:r>
-        <w:t>2</w:t>
+        <w:t>3</w:t>
       </w:r>
       <w:r>
         <w:t xml:space="preserve"> horas</w:t>
@@ -380,15 +109,7 @@
     </w:p>
     <w:p>
       <w:r>
-        <w:t xml:space="preserve">Lograr que el método </w:t>
-      </w:r>
-      <w:proofErr w:type="gramStart"/>
-      <w:r>
-        <w:t>swap(</w:t>
-      </w:r>
-      <w:proofErr w:type="gramEnd"/>
-      <w:r>
-        <w:t>) funcione adecuadamente.</w:t>
+        <w:t>Lograr resolver el problema, plantear la lógica</w:t>
       </w:r>
     </w:p>
     <w:p>
@@ -400,13 +121,12 @@
         </w:numPr>
       </w:pPr>
       <w:r>
-        <w:lastRenderedPageBreak/>
         <w:t>¿Cuál consideran que fue el mayor problema técnico? ¿Qué hicieron para resolverlo?</w:t>
       </w:r>
     </w:p>
     <w:p>
       <w:r>
-        <w:t>No tuvimos ningún problema técnico notable en este ciclo.</w:t>
+        <w:t>Plantear la solución para resolver correctamente.</w:t>
       </w:r>
     </w:p>
     <w:p>
@@ -443,15 +163,7 @@
     </w:p>
     <w:p>
       <w:r>
-        <w:t xml:space="preserve">Pair </w:t>
-      </w:r>
-      <w:proofErr w:type="spellStart"/>
-      <w:r>
-        <w:t>programming</w:t>
-      </w:r>
-      <w:proofErr w:type="spellEnd"/>
-      <w:r>
-        <w:t xml:space="preserve">, intentamos siempre aplicarla, haciendo que solo uno programe </w:t>
+        <w:t xml:space="preserve">Pair programming, intentamos siempre aplicarla, haciendo que solo uno programe </w:t>
       </w:r>
       <w:r>
         <w:t xml:space="preserve">o modele </w:t>
@@ -1769,6 +1481,7 @@
   <w:style w:type="character" w:default="1" w:styleId="Fuentedeprrafopredeter">
     <w:name w:val="Default Paragraph Font"/>
     <w:uiPriority w:val="1"/>
+    <w:semiHidden/>
     <w:unhideWhenUsed/>
   </w:style>
   <w:style w:type="table" w:default="1" w:styleId="Tablanormal">

</xml_diff>

<commit_message>
Ciclo 4 completo, mi computador no tenia internet al subir las cosas al repo cuando los habia subido antes
</commit_message>
<xml_diff>
--- a/RetrospectivaStackingItems.docx
+++ b/RetrospectivaStackingItems.docx
@@ -11,35 +11,60 @@
         </w:numPr>
       </w:pPr>
       <w:r>
-        <w:t>¿Cuáles fueron los mini-ciclos definidos? Justifíquenlos.</w:t>
+        <w:t xml:space="preserve">¿Cuáles fueron los </w:t>
+      </w:r>
+      <w:proofErr w:type="spellStart"/>
+      <w:r>
+        <w:t>mini-ciclos</w:t>
+      </w:r>
+      <w:proofErr w:type="spellEnd"/>
+      <w:r>
+        <w:t xml:space="preserve"> definidos? Justifíquenlos.</w:t>
       </w:r>
     </w:p>
     <w:p>
-      <w:r>
-        <w:t xml:space="preserve">Mini-ciclo 1: </w:t>
-      </w:r>
-      <w:r>
-        <w:t>Plantear la lógica y el código para solucionar TowerContest</w:t>
+      <w:proofErr w:type="spellStart"/>
+      <w:r>
+        <w:t>Mini-ciclo</w:t>
+      </w:r>
+      <w:proofErr w:type="spellEnd"/>
+      <w:r>
+        <w:t xml:space="preserve"> 1:</w:t>
+      </w:r>
+      <w:r>
+        <w:t xml:space="preserve"> Planeación y desarrollo de la implementación de los nuevos tipos de tazas y tapas</w:t>
       </w:r>
     </w:p>
     <w:p>
-      <w:r>
-        <w:t xml:space="preserve">Mini-ciclo 2: </w:t>
-      </w:r>
-      <w:r>
-        <w:t>Crear el simulador para TowerContest</w:t>
+      <w:proofErr w:type="spellStart"/>
+      <w:r>
+        <w:t>Mini-ciclo</w:t>
+      </w:r>
+      <w:proofErr w:type="spellEnd"/>
+      <w:r>
+        <w:t xml:space="preserve"> 2: </w:t>
+      </w:r>
+      <w:r>
+        <w:t>Realización de las pruebas de unidad correspondientes</w:t>
       </w:r>
     </w:p>
     <w:p>
-      <w:r>
-        <w:t xml:space="preserve">Mini-ciclo 3: </w:t>
-      </w:r>
-      <w:r>
-        <w:t>Pruebas</w:t>
-      </w:r>
-      <w:r>
-        <w:t>.</w:t>
-      </w:r>
+      <w:proofErr w:type="spellStart"/>
+      <w:r>
+        <w:t>Mini-ciclo</w:t>
+      </w:r>
+      <w:proofErr w:type="spellEnd"/>
+      <w:r>
+        <w:t xml:space="preserve"> 3: </w:t>
+      </w:r>
+      <w:r>
+        <w:t xml:space="preserve">Realización de las dos pruebas de </w:t>
+      </w:r>
+      <w:proofErr w:type="spellStart"/>
+      <w:r>
+        <w:t>aceptacion</w:t>
+      </w:r>
+      <w:proofErr w:type="spellEnd"/>
     </w:p>
     <w:p>
       <w:pPr>
@@ -50,16 +75,37 @@
         </w:numPr>
       </w:pPr>
       <w:r>
-        <w:t>¿Cuál es el estado actual del proyecto en términos de mini-ciclos? ¿por qué?</w:t>
+        <w:t xml:space="preserve">¿Cuál es el estado actual del proyecto en términos de </w:t>
+      </w:r>
+      <w:proofErr w:type="spellStart"/>
+      <w:r>
+        <w:t>mini-ciclos</w:t>
+      </w:r>
+      <w:proofErr w:type="spellEnd"/>
+      <w:r>
+        <w:t>? ¿por qué?</w:t>
       </w:r>
     </w:p>
     <w:p>
       <w:r>
-        <w:t xml:space="preserve">Cumplimos con los mini-ciclos, </w:t>
-      </w:r>
-      <w:r>
-        <w:t>con las pruebas que realizamos se cumple lo que propusimos en los miniciclos</w:t>
-      </w:r>
+        <w:t xml:space="preserve">Cumplimos con los </w:t>
+      </w:r>
+      <w:proofErr w:type="spellStart"/>
+      <w:r>
+        <w:t>mini-ciclos</w:t>
+      </w:r>
+      <w:proofErr w:type="spellEnd"/>
+      <w:r>
+        <w:t xml:space="preserve">, </w:t>
+      </w:r>
+      <w:r>
+        <w:t xml:space="preserve">con las pruebas que realizamos se cumple lo que propusimos en los </w:t>
+      </w:r>
+      <w:proofErr w:type="spellStart"/>
+      <w:r>
+        <w:t>miniciclos</w:t>
+      </w:r>
+      <w:proofErr w:type="spellEnd"/>
     </w:p>
     <w:p>
       <w:pPr>
@@ -109,7 +155,7 @@
     </w:p>
     <w:p>
       <w:r>
-        <w:t>Lograr resolver el problema, plantear la lógica</w:t>
+        <w:t>Implementar cada detalle específico de como se comporta cada tipo de taza o tapa en diversas situaciones</w:t>
       </w:r>
     </w:p>
     <w:p>
@@ -126,7 +172,15 @@
     </w:p>
     <w:p>
       <w:r>
-        <w:t>Plantear la solución para resolver correctamente.</w:t>
+        <w:t xml:space="preserve">Usar </w:t>
+      </w:r>
+      <w:proofErr w:type="spellStart"/>
+      <w:r>
+        <w:t>JoptionPane</w:t>
+      </w:r>
+      <w:proofErr w:type="spellEnd"/>
+      <w:r>
+        <w:t xml:space="preserve"> porque, aunque lo habíamos usado bastantes veces antes, tuvimos que usar cosas nuevas</w:t>
       </w:r>
     </w:p>
     <w:p>
@@ -163,7 +217,15 @@
     </w:p>
     <w:p>
       <w:r>
-        <w:t xml:space="preserve">Pair programming, intentamos siempre aplicarla, haciendo que solo uno programe </w:t>
+        <w:t xml:space="preserve">Pair </w:t>
+      </w:r>
+      <w:proofErr w:type="spellStart"/>
+      <w:r>
+        <w:t>programming</w:t>
+      </w:r>
+      <w:proofErr w:type="spellEnd"/>
+      <w:r>
+        <w:t xml:space="preserve">, intentamos siempre aplicarla, haciendo que solo uno programe </w:t>
       </w:r>
       <w:r>
         <w:t xml:space="preserve">o modele </w:t>

</xml_diff>